<commit_message>
updated confidential address language in every NOH and proof of service
</commit_message>
<xml_diff>
--- a/docassemble/MLHDivorceAndCustody/data/templates/noh_divorce.docx
+++ b/docassemble/MLHDivorceAndCustody/data/templates/noh_divorce.docx
@@ -37,53 +37,7 @@
           <w:sz w:val="22"/>
           <w:szCs w:val="22"/>
         </w:rPr>
-        <w:t xml:space="preserve">IN THE FAMILY DIVISION FOR </w:t>
-      </w:r>
-      <w:proofErr w:type="gramStart"/>
-      <w:r>
-        <w:rPr>
-          <w:rFonts w:ascii="Times New Roman" w:hAnsi="Times New Roman" w:cs="Times New Roman"/>
-          <w:sz w:val="22"/>
-          <w:szCs w:val="22"/>
-        </w:rPr>
-        <w:t xml:space="preserve">THE  {{ </w:t>
-      </w:r>
-      <w:proofErr w:type="spellStart"/>
-      <w:r>
-        <w:rPr>
-          <w:rFonts w:ascii="Times New Roman" w:hAnsi="Times New Roman" w:cs="Times New Roman"/>
-          <w:sz w:val="22"/>
-          <w:szCs w:val="22"/>
-        </w:rPr>
-        <w:t>the</w:t>
-      </w:r>
-      <w:proofErr w:type="gramEnd"/>
-      <w:r>
-        <w:rPr>
-          <w:rFonts w:ascii="Times New Roman" w:hAnsi="Times New Roman" w:cs="Times New Roman"/>
-          <w:sz w:val="22"/>
-          <w:szCs w:val="22"/>
-        </w:rPr>
-        <w:t>_</w:t>
-      </w:r>
-      <w:proofErr w:type="gramStart"/>
-      <w:r>
-        <w:rPr>
-          <w:rFonts w:ascii="Times New Roman" w:hAnsi="Times New Roman" w:cs="Times New Roman"/>
-          <w:sz w:val="22"/>
-          <w:szCs w:val="22"/>
-        </w:rPr>
-        <w:t>court.number</w:t>
-      </w:r>
-      <w:proofErr w:type="spellEnd"/>
-      <w:proofErr w:type="gramEnd"/>
-      <w:r>
-        <w:rPr>
-          <w:rFonts w:ascii="Times New Roman" w:hAnsi="Times New Roman" w:cs="Times New Roman"/>
-          <w:sz w:val="22"/>
-          <w:szCs w:val="22"/>
-        </w:rPr>
-        <w:t xml:space="preserve"> }} JUDICIAL CIRCUIT</w:t>
+        <w:t>IN THE FAMILY DIVISION FOR THE  {{ the_court.number }} JUDICIAL CIRCUIT</w:t>
       </w:r>
     </w:p>
     <w:p>
@@ -102,61 +56,7 @@
           <w:sz w:val="22"/>
           <w:szCs w:val="22"/>
         </w:rPr>
-        <w:t xml:space="preserve">COUNTY OF </w:t>
-      </w:r>
-      <w:proofErr w:type="gramStart"/>
-      <w:r>
-        <w:rPr>
-          <w:rFonts w:ascii="Times New Roman" w:hAnsi="Times New Roman" w:cs="Times New Roman"/>
-          <w:sz w:val="22"/>
-          <w:szCs w:val="22"/>
-        </w:rPr>
-        <w:t xml:space="preserve">{{ </w:t>
-      </w:r>
-      <w:proofErr w:type="spellStart"/>
-      <w:r>
-        <w:rPr>
-          <w:rFonts w:ascii="Times New Roman" w:hAnsi="Times New Roman" w:cs="Times New Roman"/>
-          <w:sz w:val="22"/>
-          <w:szCs w:val="22"/>
-        </w:rPr>
-        <w:t>county</w:t>
-      </w:r>
-      <w:proofErr w:type="gramEnd"/>
-      <w:r>
-        <w:rPr>
-          <w:rFonts w:ascii="Times New Roman" w:hAnsi="Times New Roman" w:cs="Times New Roman"/>
-          <w:sz w:val="22"/>
-          <w:szCs w:val="22"/>
-        </w:rPr>
-        <w:t>_choice</w:t>
-      </w:r>
-      <w:proofErr w:type="spellEnd"/>
-      <w:r>
-        <w:rPr>
-          <w:rFonts w:ascii="Times New Roman" w:hAnsi="Times New Roman" w:cs="Times New Roman"/>
-          <w:sz w:val="22"/>
-          <w:szCs w:val="22"/>
-        </w:rPr>
-        <w:t xml:space="preserve"> | </w:t>
-      </w:r>
-      <w:proofErr w:type="gramStart"/>
-      <w:r>
-        <w:rPr>
-          <w:rFonts w:ascii="Times New Roman" w:hAnsi="Times New Roman" w:cs="Times New Roman"/>
-          <w:sz w:val="22"/>
-          <w:szCs w:val="22"/>
-        </w:rPr>
-        <w:t>upper }</w:t>
-      </w:r>
-      <w:proofErr w:type="gramEnd"/>
-      <w:r>
-        <w:rPr>
-          <w:rFonts w:ascii="Times New Roman" w:hAnsi="Times New Roman" w:cs="Times New Roman"/>
-          <w:sz w:val="22"/>
-          <w:szCs w:val="22"/>
-        </w:rPr>
-        <w:t>}</w:t>
+        <w:t>COUNTY OF {{ county_choice | upper }}</w:t>
       </w:r>
     </w:p>
     <w:p>
@@ -213,59 +113,13 @@
                 <w:szCs w:val="22"/>
               </w:rPr>
             </w:pPr>
-            <w:proofErr w:type="gramStart"/>
             <w:r>
               <w:rPr>
                 <w:rFonts w:ascii="Times New Roman" w:hAnsi="Times New Roman" w:cs="Times New Roman"/>
                 <w:sz w:val="22"/>
                 <w:szCs w:val="22"/>
               </w:rPr>
-              <w:t>{{ plaintiffs</w:t>
-            </w:r>
-            <w:proofErr w:type="gramEnd"/>
-            <w:r>
-              <w:rPr>
-                <w:rFonts w:ascii="Times New Roman" w:hAnsi="Times New Roman" w:cs="Times New Roman"/>
-                <w:sz w:val="22"/>
-                <w:szCs w:val="22"/>
-              </w:rPr>
-              <w:t>[0].</w:t>
-            </w:r>
-            <w:proofErr w:type="spellStart"/>
-            <w:r>
-              <w:rPr>
-                <w:rFonts w:ascii="Times New Roman" w:hAnsi="Times New Roman" w:cs="Times New Roman"/>
-                <w:sz w:val="22"/>
-                <w:szCs w:val="22"/>
-              </w:rPr>
-              <w:t>name_</w:t>
-            </w:r>
-            <w:proofErr w:type="gramStart"/>
-            <w:r>
-              <w:rPr>
-                <w:rFonts w:ascii="Times New Roman" w:hAnsi="Times New Roman" w:cs="Times New Roman"/>
-                <w:sz w:val="22"/>
-                <w:szCs w:val="22"/>
-              </w:rPr>
-              <w:t>full</w:t>
-            </w:r>
-            <w:proofErr w:type="spellEnd"/>
-            <w:r>
-              <w:rPr>
-                <w:rFonts w:ascii="Times New Roman" w:hAnsi="Times New Roman" w:cs="Times New Roman"/>
-                <w:sz w:val="22"/>
-                <w:szCs w:val="22"/>
-              </w:rPr>
-              <w:t>() }</w:t>
-            </w:r>
-            <w:proofErr w:type="gramEnd"/>
-            <w:r>
-              <w:rPr>
-                <w:rFonts w:ascii="Times New Roman" w:hAnsi="Times New Roman" w:cs="Times New Roman"/>
-                <w:sz w:val="22"/>
-                <w:szCs w:val="22"/>
-              </w:rPr>
-              <w:t>}</w:t>
+              <w:t>{{ plaintiffs[0].name_full() }}</w:t>
             </w:r>
           </w:p>
           <w:p>
@@ -333,59 +187,13 @@
                 <w:szCs w:val="22"/>
               </w:rPr>
             </w:pPr>
-            <w:proofErr w:type="gramStart"/>
             <w:r>
               <w:rPr>
                 <w:rFonts w:ascii="Times New Roman" w:hAnsi="Times New Roman" w:cs="Times New Roman"/>
                 <w:sz w:val="22"/>
                 <w:szCs w:val="22"/>
               </w:rPr>
-              <w:t>{{ defendants</w:t>
-            </w:r>
-            <w:proofErr w:type="gramEnd"/>
-            <w:r>
-              <w:rPr>
-                <w:rFonts w:ascii="Times New Roman" w:hAnsi="Times New Roman" w:cs="Times New Roman"/>
-                <w:sz w:val="22"/>
-                <w:szCs w:val="22"/>
-              </w:rPr>
-              <w:t>[0].</w:t>
-            </w:r>
-            <w:proofErr w:type="spellStart"/>
-            <w:r>
-              <w:rPr>
-                <w:rFonts w:ascii="Times New Roman" w:hAnsi="Times New Roman" w:cs="Times New Roman"/>
-                <w:sz w:val="22"/>
-                <w:szCs w:val="22"/>
-              </w:rPr>
-              <w:t>name_</w:t>
-            </w:r>
-            <w:proofErr w:type="gramStart"/>
-            <w:r>
-              <w:rPr>
-                <w:rFonts w:ascii="Times New Roman" w:hAnsi="Times New Roman" w:cs="Times New Roman"/>
-                <w:sz w:val="22"/>
-                <w:szCs w:val="22"/>
-              </w:rPr>
-              <w:t>full</w:t>
-            </w:r>
-            <w:proofErr w:type="spellEnd"/>
-            <w:r>
-              <w:rPr>
-                <w:rFonts w:ascii="Times New Roman" w:hAnsi="Times New Roman" w:cs="Times New Roman"/>
-                <w:sz w:val="22"/>
-                <w:szCs w:val="22"/>
-              </w:rPr>
-              <w:t>() }</w:t>
-            </w:r>
-            <w:proofErr w:type="gramEnd"/>
-            <w:r>
-              <w:rPr>
-                <w:rFonts w:ascii="Times New Roman" w:hAnsi="Times New Roman" w:cs="Times New Roman"/>
-                <w:sz w:val="22"/>
-                <w:szCs w:val="22"/>
-              </w:rPr>
-              <w:t>}</w:t>
+              <w:t>{{ defendants[0].name_full() }}</w:t>
             </w:r>
           </w:p>
           <w:p>
@@ -484,7 +292,6 @@
               </w:rPr>
               <w:t xml:space="preserve"> </w:t>
             </w:r>
-            <w:proofErr w:type="gramStart"/>
             <w:r>
               <w:rPr>
                 <w:rFonts w:ascii="Times New Roman" w:hAnsi="Times New Roman" w:cs="Times New Roman"/>
@@ -492,57 +299,7 @@
                 <w:szCs w:val="22"/>
                 <w:u w:val="single"/>
               </w:rPr>
-              <w:t xml:space="preserve">{{ </w:t>
-            </w:r>
-            <w:proofErr w:type="spellStart"/>
-            <w:r>
-              <w:rPr>
-                <w:rFonts w:ascii="Times New Roman" w:hAnsi="Times New Roman" w:cs="Times New Roman"/>
-                <w:sz w:val="22"/>
-                <w:szCs w:val="22"/>
-                <w:u w:val="single"/>
-              </w:rPr>
-              <w:t>docket</w:t>
-            </w:r>
-            <w:proofErr w:type="gramEnd"/>
-            <w:r>
-              <w:rPr>
-                <w:rFonts w:ascii="Times New Roman" w:hAnsi="Times New Roman" w:cs="Times New Roman"/>
-                <w:sz w:val="22"/>
-                <w:szCs w:val="22"/>
-                <w:u w:val="single"/>
-              </w:rPr>
-              <w:t>_</w:t>
-            </w:r>
-            <w:proofErr w:type="gramStart"/>
-            <w:r>
-              <w:rPr>
-                <w:rFonts w:ascii="Times New Roman" w:hAnsi="Times New Roman" w:cs="Times New Roman"/>
-                <w:sz w:val="22"/>
-                <w:szCs w:val="22"/>
-                <w:u w:val="single"/>
-              </w:rPr>
-              <w:t>number</w:t>
-            </w:r>
-            <w:proofErr w:type="spellEnd"/>
-            <w:r>
-              <w:rPr>
-                <w:rFonts w:ascii="Times New Roman" w:hAnsi="Times New Roman" w:cs="Times New Roman"/>
-                <w:sz w:val="22"/>
-                <w:szCs w:val="22"/>
-                <w:u w:val="single"/>
-              </w:rPr>
-              <w:t xml:space="preserve"> }</w:t>
-            </w:r>
-            <w:proofErr w:type="gramEnd"/>
-            <w:r>
-              <w:rPr>
-                <w:rFonts w:ascii="Times New Roman" w:hAnsi="Times New Roman" w:cs="Times New Roman"/>
-                <w:sz w:val="22"/>
-                <w:szCs w:val="22"/>
-                <w:u w:val="single"/>
-              </w:rPr>
-              <w:t>}</w:t>
+              <w:t>{{ docket_number }}</w:t>
             </w:r>
           </w:p>
           <w:p>
@@ -603,59 +360,13 @@
           <w:szCs w:val="21"/>
         </w:rPr>
       </w:pPr>
-      <w:proofErr w:type="gramStart"/>
-      <w:r>
-        <w:rPr>
-          <w:rFonts w:ascii="Times New Roman" w:hAnsi="Times New Roman" w:cs="Times New Roman"/>
-          <w:sz w:val="21"/>
-          <w:szCs w:val="21"/>
-        </w:rPr>
-        <w:t>{{ plaintiffs</w:t>
-      </w:r>
-      <w:proofErr w:type="gramEnd"/>
-      <w:r>
-        <w:rPr>
-          <w:rFonts w:ascii="Times New Roman" w:hAnsi="Times New Roman" w:cs="Times New Roman"/>
-          <w:sz w:val="21"/>
-          <w:szCs w:val="21"/>
-        </w:rPr>
-        <w:t>[0].</w:t>
-      </w:r>
-      <w:proofErr w:type="spellStart"/>
-      <w:r>
-        <w:rPr>
-          <w:rFonts w:ascii="Times New Roman" w:hAnsi="Times New Roman" w:cs="Times New Roman"/>
-          <w:sz w:val="21"/>
-          <w:szCs w:val="21"/>
-        </w:rPr>
-        <w:t>name_</w:t>
-      </w:r>
-      <w:proofErr w:type="gramStart"/>
-      <w:r>
-        <w:rPr>
-          <w:rFonts w:ascii="Times New Roman" w:hAnsi="Times New Roman" w:cs="Times New Roman"/>
-          <w:sz w:val="21"/>
-          <w:szCs w:val="21"/>
-        </w:rPr>
-        <w:t>full</w:t>
-      </w:r>
-      <w:proofErr w:type="spellEnd"/>
-      <w:r>
-        <w:rPr>
-          <w:rFonts w:ascii="Times New Roman" w:hAnsi="Times New Roman" w:cs="Times New Roman"/>
-          <w:sz w:val="21"/>
-          <w:szCs w:val="21"/>
-        </w:rPr>
-        <w:t>() }</w:t>
-      </w:r>
-      <w:proofErr w:type="gramEnd"/>
-      <w:r>
-        <w:rPr>
-          <w:rFonts w:ascii="Times New Roman" w:hAnsi="Times New Roman" w:cs="Times New Roman"/>
-          <w:sz w:val="21"/>
-          <w:szCs w:val="21"/>
-        </w:rPr>
-        <w:t>}</w:t>
+      <w:r>
+        <w:rPr>
+          <w:rFonts w:ascii="Times New Roman" w:hAnsi="Times New Roman" w:cs="Times New Roman"/>
+          <w:sz w:val="21"/>
+          <w:szCs w:val="21"/>
+        </w:rPr>
+        <w:t>{{ plaintiffs[0].name_full() }}</w:t>
       </w:r>
     </w:p>
     <w:p>
@@ -673,36 +384,8 @@
           <w:sz w:val="21"/>
           <w:szCs w:val="21"/>
         </w:rPr>
-        <w:t xml:space="preserve">{%p if </w:t>
-      </w:r>
-      <w:proofErr w:type="spellStart"/>
-      <w:r>
-        <w:rPr>
-          <w:rFonts w:ascii="Times New Roman" w:hAnsi="Times New Roman" w:cs="Times New Roman"/>
-          <w:sz w:val="21"/>
-          <w:szCs w:val="21"/>
-        </w:rPr>
-        <w:t>confidential_contact_info_</w:t>
-      </w:r>
-      <w:proofErr w:type="gramStart"/>
-      <w:r>
-        <w:rPr>
-          <w:rFonts w:ascii="Times New Roman" w:hAnsi="Times New Roman" w:cs="Times New Roman"/>
-          <w:sz w:val="21"/>
-          <w:szCs w:val="21"/>
-        </w:rPr>
-        <w:t>yn</w:t>
-      </w:r>
-      <w:proofErr w:type="spellEnd"/>
-      <w:r>
-        <w:rPr>
-          <w:rFonts w:ascii="Times New Roman" w:hAnsi="Times New Roman" w:cs="Times New Roman"/>
-          <w:sz w:val="21"/>
-          <w:szCs w:val="21"/>
-        </w:rPr>
-        <w:t xml:space="preserve"> %}</w:t>
-      </w:r>
-      <w:proofErr w:type="gramEnd"/>
+        <w:t>{%p if confidential_contact_info_yn %}</w:t>
+      </w:r>
     </w:p>
     <w:p>
       <w:pPr>
@@ -719,7 +402,7 @@
           <w:sz w:val="21"/>
           <w:szCs w:val="21"/>
         </w:rPr>
-        <w:t>Confidential – Mailing address:</w:t>
+        <w:t>Confidential/alternative address:</w:t>
       </w:r>
     </w:p>
     <w:p>
@@ -737,18 +420,8 @@
           <w:sz w:val="21"/>
           <w:szCs w:val="21"/>
         </w:rPr>
-        <w:t xml:space="preserve">{%p </w:t>
-      </w:r>
-      <w:proofErr w:type="gramStart"/>
-      <w:r>
-        <w:rPr>
-          <w:rFonts w:ascii="Times New Roman" w:hAnsi="Times New Roman" w:cs="Times New Roman"/>
-          <w:sz w:val="21"/>
-          <w:szCs w:val="21"/>
-        </w:rPr>
-        <w:t>endif %}</w:t>
-      </w:r>
-      <w:proofErr w:type="gramEnd"/>
+        <w:t>{%p endif %}</w:t>
+      </w:r>
     </w:p>
     <w:p>
       <w:pPr>
@@ -760,77 +433,13 @@
           <w:szCs w:val="21"/>
         </w:rPr>
       </w:pPr>
-      <w:proofErr w:type="gramStart"/>
-      <w:r>
-        <w:rPr>
-          <w:rFonts w:ascii="Times New Roman" w:hAnsi="Times New Roman" w:cs="Times New Roman"/>
-          <w:sz w:val="21"/>
-          <w:szCs w:val="21"/>
-        </w:rPr>
-        <w:t>{{ plaintiffs</w:t>
-      </w:r>
-      <w:proofErr w:type="gramEnd"/>
-      <w:r>
-        <w:rPr>
-          <w:rFonts w:ascii="Times New Roman" w:hAnsi="Times New Roman" w:cs="Times New Roman"/>
-          <w:sz w:val="21"/>
-          <w:szCs w:val="21"/>
-        </w:rPr>
-        <w:t>[0</w:t>
-      </w:r>
-      <w:proofErr w:type="gramStart"/>
-      <w:r>
-        <w:rPr>
-          <w:rFonts w:ascii="Times New Roman" w:hAnsi="Times New Roman" w:cs="Times New Roman"/>
-          <w:sz w:val="21"/>
-          <w:szCs w:val="21"/>
-        </w:rPr>
-        <w:t>].</w:t>
-      </w:r>
-      <w:proofErr w:type="spellStart"/>
-      <w:r>
-        <w:rPr>
-          <w:rFonts w:ascii="Times New Roman" w:hAnsi="Times New Roman" w:cs="Times New Roman"/>
-          <w:sz w:val="21"/>
-          <w:szCs w:val="21"/>
-        </w:rPr>
-        <w:t>address</w:t>
-      </w:r>
-      <w:proofErr w:type="gramEnd"/>
-      <w:r>
-        <w:rPr>
-          <w:rFonts w:ascii="Times New Roman" w:hAnsi="Times New Roman" w:cs="Times New Roman"/>
-          <w:sz w:val="21"/>
-          <w:szCs w:val="21"/>
-        </w:rPr>
-        <w:t>.line_</w:t>
-      </w:r>
-      <w:proofErr w:type="gramStart"/>
-      <w:r>
-        <w:rPr>
-          <w:rFonts w:ascii="Times New Roman" w:hAnsi="Times New Roman" w:cs="Times New Roman"/>
-          <w:sz w:val="21"/>
-          <w:szCs w:val="21"/>
-        </w:rPr>
-        <w:t>one</w:t>
-      </w:r>
-      <w:proofErr w:type="spellEnd"/>
-      <w:r>
-        <w:rPr>
-          <w:rFonts w:ascii="Times New Roman" w:hAnsi="Times New Roman" w:cs="Times New Roman"/>
-          <w:sz w:val="21"/>
-          <w:szCs w:val="21"/>
-        </w:rPr>
-        <w:t>() }</w:t>
-      </w:r>
-      <w:proofErr w:type="gramEnd"/>
-      <w:r>
-        <w:rPr>
-          <w:rFonts w:ascii="Times New Roman" w:hAnsi="Times New Roman" w:cs="Times New Roman"/>
-          <w:sz w:val="21"/>
-          <w:szCs w:val="21"/>
-        </w:rPr>
-        <w:t>}</w:t>
+      <w:r>
+        <w:rPr>
+          <w:rFonts w:ascii="Times New Roman" w:hAnsi="Times New Roman" w:cs="Times New Roman"/>
+          <w:sz w:val="21"/>
+          <w:szCs w:val="21"/>
+        </w:rPr>
+        <w:t>{{ plaintiffs[0].address.line_one() }}</w:t>
       </w:r>
     </w:p>
     <w:p>
@@ -843,77 +452,13 @@
           <w:szCs w:val="21"/>
         </w:rPr>
       </w:pPr>
-      <w:proofErr w:type="gramStart"/>
-      <w:r>
-        <w:rPr>
-          <w:rFonts w:ascii="Times New Roman" w:hAnsi="Times New Roman" w:cs="Times New Roman"/>
-          <w:sz w:val="21"/>
-          <w:szCs w:val="21"/>
-        </w:rPr>
-        <w:t>{{ plaintiffs</w:t>
-      </w:r>
-      <w:proofErr w:type="gramEnd"/>
-      <w:r>
-        <w:rPr>
-          <w:rFonts w:ascii="Times New Roman" w:hAnsi="Times New Roman" w:cs="Times New Roman"/>
-          <w:sz w:val="21"/>
-          <w:szCs w:val="21"/>
-        </w:rPr>
-        <w:t>[0</w:t>
-      </w:r>
-      <w:proofErr w:type="gramStart"/>
-      <w:r>
-        <w:rPr>
-          <w:rFonts w:ascii="Times New Roman" w:hAnsi="Times New Roman" w:cs="Times New Roman"/>
-          <w:sz w:val="21"/>
-          <w:szCs w:val="21"/>
-        </w:rPr>
-        <w:t>].</w:t>
-      </w:r>
-      <w:proofErr w:type="spellStart"/>
-      <w:r>
-        <w:rPr>
-          <w:rFonts w:ascii="Times New Roman" w:hAnsi="Times New Roman" w:cs="Times New Roman"/>
-          <w:sz w:val="21"/>
-          <w:szCs w:val="21"/>
-        </w:rPr>
-        <w:t>address</w:t>
-      </w:r>
-      <w:proofErr w:type="gramEnd"/>
-      <w:r>
-        <w:rPr>
-          <w:rFonts w:ascii="Times New Roman" w:hAnsi="Times New Roman" w:cs="Times New Roman"/>
-          <w:sz w:val="21"/>
-          <w:szCs w:val="21"/>
-        </w:rPr>
-        <w:t>.line_</w:t>
-      </w:r>
-      <w:proofErr w:type="gramStart"/>
-      <w:r>
-        <w:rPr>
-          <w:rFonts w:ascii="Times New Roman" w:hAnsi="Times New Roman" w:cs="Times New Roman"/>
-          <w:sz w:val="21"/>
-          <w:szCs w:val="21"/>
-        </w:rPr>
-        <w:t>two</w:t>
-      </w:r>
-      <w:proofErr w:type="spellEnd"/>
-      <w:r>
-        <w:rPr>
-          <w:rFonts w:ascii="Times New Roman" w:hAnsi="Times New Roman" w:cs="Times New Roman"/>
-          <w:sz w:val="21"/>
-          <w:szCs w:val="21"/>
-        </w:rPr>
-        <w:t>() }</w:t>
-      </w:r>
-      <w:proofErr w:type="gramEnd"/>
-      <w:r>
-        <w:rPr>
-          <w:rFonts w:ascii="Times New Roman" w:hAnsi="Times New Roman" w:cs="Times New Roman"/>
-          <w:sz w:val="21"/>
-          <w:szCs w:val="21"/>
-        </w:rPr>
-        <w:t>}</w:t>
+      <w:r>
+        <w:rPr>
+          <w:rFonts w:ascii="Times New Roman" w:hAnsi="Times New Roman" w:cs="Times New Roman"/>
+          <w:sz w:val="21"/>
+          <w:szCs w:val="21"/>
+        </w:rPr>
+        <w:t>{{ plaintiffs[0].address.line_two() }}</w:t>
       </w:r>
     </w:p>
     <w:p>
@@ -934,121 +479,37 @@
         </w:rPr>
         <w:t xml:space="preserve">{% if </w:t>
       </w:r>
-      <w:proofErr w:type="gramStart"/>
-      <w:r>
-        <w:rPr>
-          <w:rFonts w:ascii="Times New Roman" w:hAnsi="Times New Roman" w:cs="Times New Roman"/>
-          <w:sz w:val="21"/>
-          <w:szCs w:val="21"/>
-        </w:rPr>
-        <w:t>plaintiffs[</w:t>
-      </w:r>
-      <w:proofErr w:type="gramEnd"/>
-      <w:r>
-        <w:rPr>
-          <w:rFonts w:ascii="Times New Roman" w:hAnsi="Times New Roman" w:cs="Times New Roman"/>
-          <w:sz w:val="21"/>
-          <w:szCs w:val="21"/>
-        </w:rPr>
-        <w:t>0].</w:t>
-      </w:r>
-      <w:proofErr w:type="spellStart"/>
-      <w:r>
-        <w:rPr>
-          <w:rFonts w:ascii="Times New Roman" w:hAnsi="Times New Roman" w:cs="Times New Roman"/>
-          <w:sz w:val="21"/>
-          <w:szCs w:val="21"/>
-        </w:rPr>
-        <w:t>no_phone_number</w:t>
-      </w:r>
-      <w:proofErr w:type="spellEnd"/>
-      <w:r>
-        <w:rPr>
-          <w:rFonts w:ascii="Times New Roman" w:hAnsi="Times New Roman" w:cs="Times New Roman"/>
-          <w:sz w:val="21"/>
-          <w:szCs w:val="21"/>
-        </w:rPr>
-        <w:t xml:space="preserve"> </w:t>
-      </w:r>
-      <w:proofErr w:type="gramStart"/>
-      <w:r>
-        <w:rPr>
-          <w:rFonts w:ascii="Times New Roman" w:hAnsi="Times New Roman" w:cs="Times New Roman"/>
-          <w:sz w:val="21"/>
-          <w:szCs w:val="21"/>
-        </w:rPr>
-        <w:t>%}</w:t>
-      </w:r>
-      <w:r>
-        <w:rPr>
-          <w:rFonts w:ascii="Times New Roman" w:hAnsi="Times New Roman" w:cs="Times New Roman"/>
-          <w:sz w:val="21"/>
-          <w:szCs w:val="21"/>
-        </w:rPr>
-        <w:t>Does</w:t>
-      </w:r>
-      <w:proofErr w:type="gramEnd"/>
-      <w:r>
-        <w:rPr>
-          <w:rFonts w:ascii="Times New Roman" w:hAnsi="Times New Roman" w:cs="Times New Roman"/>
-          <w:sz w:val="21"/>
-          <w:szCs w:val="21"/>
-        </w:rPr>
-        <w:t xml:space="preserve"> not have </w:t>
-      </w:r>
-      <w:proofErr w:type="gramStart"/>
-      <w:r>
-        <w:rPr>
-          <w:rFonts w:ascii="Times New Roman" w:hAnsi="Times New Roman" w:cs="Times New Roman"/>
-          <w:sz w:val="21"/>
-          <w:szCs w:val="21"/>
-        </w:rPr>
-        <w:t>phone{</w:t>
-      </w:r>
-      <w:proofErr w:type="gramEnd"/>
-      <w:r>
-        <w:rPr>
-          <w:rFonts w:ascii="Times New Roman" w:hAnsi="Times New Roman" w:cs="Times New Roman"/>
-          <w:sz w:val="21"/>
-          <w:szCs w:val="21"/>
-        </w:rPr>
-        <w:t xml:space="preserve">% else </w:t>
-      </w:r>
-      <w:proofErr w:type="gramStart"/>
-      <w:r>
-        <w:rPr>
-          <w:rFonts w:ascii="Times New Roman" w:hAnsi="Times New Roman" w:cs="Times New Roman"/>
-          <w:sz w:val="21"/>
-          <w:szCs w:val="21"/>
-        </w:rPr>
-        <w:t xml:space="preserve">%}{{ </w:t>
-      </w:r>
-      <w:proofErr w:type="spellStart"/>
-      <w:r>
-        <w:rPr>
-          <w:rFonts w:ascii="Times New Roman" w:hAnsi="Times New Roman" w:cs="Times New Roman"/>
-          <w:sz w:val="21"/>
-          <w:szCs w:val="21"/>
-        </w:rPr>
-        <w:t>phone</w:t>
-      </w:r>
-      <w:proofErr w:type="gramEnd"/>
-      <w:r>
-        <w:rPr>
-          <w:rFonts w:ascii="Times New Roman" w:hAnsi="Times New Roman" w:cs="Times New Roman"/>
-          <w:sz w:val="21"/>
-          <w:szCs w:val="21"/>
-        </w:rPr>
-        <w:t>_number_formatted</w:t>
-      </w:r>
-      <w:proofErr w:type="spellEnd"/>
-      <w:r>
-        <w:rPr>
-          <w:rFonts w:ascii="Times New Roman" w:hAnsi="Times New Roman" w:cs="Times New Roman"/>
-          <w:sz w:val="21"/>
-          <w:szCs w:val="21"/>
-        </w:rPr>
-        <w:t>(</w:t>
+      <w:r>
+        <w:rPr>
+          <w:rFonts w:ascii="Times New Roman" w:hAnsi="Times New Roman" w:cs="Times New Roman"/>
+          <w:sz w:val="21"/>
+          <w:szCs w:val="21"/>
+        </w:rPr>
+        <w:t>plaintiffs[0].no_phone_number</w:t>
+      </w:r>
+      <w:r>
+        <w:rPr>
+          <w:rFonts w:ascii="Times New Roman" w:hAnsi="Times New Roman" w:cs="Times New Roman"/>
+          <w:sz w:val="21"/>
+          <w:szCs w:val="21"/>
+        </w:rPr>
+        <w:t xml:space="preserve"> %}</w:t>
+      </w:r>
+      <w:r>
+        <w:rPr>
+          <w:rFonts w:ascii="Times New Roman" w:hAnsi="Times New Roman" w:cs="Times New Roman"/>
+          <w:sz w:val="21"/>
+          <w:szCs w:val="21"/>
+        </w:rPr>
+        <w:t xml:space="preserve">Does not have phone{% else %}{{ </w:t>
+      </w:r>
+      <w:r>
+        <w:rPr>
+          <w:rFonts w:ascii="Times New Roman" w:hAnsi="Times New Roman" w:cs="Times New Roman"/>
+          <w:sz w:val="21"/>
+          <w:szCs w:val="21"/>
+        </w:rPr>
+        <w:t>phone_number_formatted(</w:t>
       </w:r>
       <w:r>
         <w:rPr>
@@ -1064,53 +525,15 @@
           <w:sz w:val="21"/>
           <w:szCs w:val="21"/>
         </w:rPr>
-        <w:t>[0</w:t>
-      </w:r>
-      <w:proofErr w:type="gramStart"/>
-      <w:r>
-        <w:rPr>
-          <w:rFonts w:ascii="Times New Roman" w:hAnsi="Times New Roman" w:cs="Times New Roman"/>
-          <w:sz w:val="21"/>
-          <w:szCs w:val="21"/>
-        </w:rPr>
-        <w:t>].</w:t>
-      </w:r>
-      <w:proofErr w:type="spellStart"/>
-      <w:r>
-        <w:rPr>
-          <w:rFonts w:ascii="Times New Roman" w:hAnsi="Times New Roman" w:cs="Times New Roman"/>
-          <w:sz w:val="21"/>
-          <w:szCs w:val="21"/>
-        </w:rPr>
-        <w:t>phone</w:t>
-      </w:r>
-      <w:proofErr w:type="gramEnd"/>
-      <w:r>
-        <w:rPr>
-          <w:rFonts w:ascii="Times New Roman" w:hAnsi="Times New Roman" w:cs="Times New Roman"/>
-          <w:sz w:val="21"/>
-          <w:szCs w:val="21"/>
-        </w:rPr>
-        <w:t>_number</w:t>
-      </w:r>
-      <w:proofErr w:type="spellEnd"/>
-      <w:proofErr w:type="gramStart"/>
-      <w:r>
-        <w:rPr>
-          <w:rFonts w:ascii="Times New Roman" w:hAnsi="Times New Roman" w:cs="Times New Roman"/>
-          <w:sz w:val="21"/>
-          <w:szCs w:val="21"/>
-        </w:rPr>
-        <w:t>) }}{</w:t>
-      </w:r>
-      <w:proofErr w:type="gramEnd"/>
-      <w:r>
-        <w:rPr>
-          <w:rFonts w:ascii="Times New Roman" w:hAnsi="Times New Roman" w:cs="Times New Roman"/>
-          <w:sz w:val="21"/>
-          <w:szCs w:val="21"/>
-        </w:rPr>
-        <w:t>% endif %}</w:t>
+        <w:t>[0].phone_number</w:t>
+      </w:r>
+      <w:r>
+        <w:rPr>
+          <w:rFonts w:ascii="Times New Roman" w:hAnsi="Times New Roman" w:cs="Times New Roman"/>
+          <w:sz w:val="21"/>
+          <w:szCs w:val="21"/>
+        </w:rPr>
+        <w:t>) }}{% endif %}</w:t>
       </w:r>
       <w:r>
         <w:rPr>
@@ -1120,59 +543,13 @@
         </w:rPr>
         <w:br w:type="column"/>
       </w:r>
-      <w:proofErr w:type="gramStart"/>
-      <w:r>
-        <w:rPr>
-          <w:rFonts w:ascii="Times New Roman" w:hAnsi="Times New Roman" w:cs="Times New Roman"/>
-          <w:sz w:val="21"/>
-          <w:szCs w:val="21"/>
-        </w:rPr>
-        <w:t>{{ defendants</w:t>
-      </w:r>
-      <w:proofErr w:type="gramEnd"/>
-      <w:r>
-        <w:rPr>
-          <w:rFonts w:ascii="Times New Roman" w:hAnsi="Times New Roman" w:cs="Times New Roman"/>
-          <w:sz w:val="21"/>
-          <w:szCs w:val="21"/>
-        </w:rPr>
-        <w:t>[0].</w:t>
-      </w:r>
-      <w:proofErr w:type="spellStart"/>
-      <w:r>
-        <w:rPr>
-          <w:rFonts w:ascii="Times New Roman" w:hAnsi="Times New Roman" w:cs="Times New Roman"/>
-          <w:sz w:val="21"/>
-          <w:szCs w:val="21"/>
-        </w:rPr>
-        <w:t>name_</w:t>
-      </w:r>
-      <w:proofErr w:type="gramStart"/>
-      <w:r>
-        <w:rPr>
-          <w:rFonts w:ascii="Times New Roman" w:hAnsi="Times New Roman" w:cs="Times New Roman"/>
-          <w:sz w:val="21"/>
-          <w:szCs w:val="21"/>
-        </w:rPr>
-        <w:t>full</w:t>
-      </w:r>
-      <w:proofErr w:type="spellEnd"/>
-      <w:r>
-        <w:rPr>
-          <w:rFonts w:ascii="Times New Roman" w:hAnsi="Times New Roman" w:cs="Times New Roman"/>
-          <w:sz w:val="21"/>
-          <w:szCs w:val="21"/>
-        </w:rPr>
-        <w:t>() }</w:t>
-      </w:r>
-      <w:proofErr w:type="gramEnd"/>
-      <w:r>
-        <w:rPr>
-          <w:rFonts w:ascii="Times New Roman" w:hAnsi="Times New Roman" w:cs="Times New Roman"/>
-          <w:sz w:val="21"/>
-          <w:szCs w:val="21"/>
-        </w:rPr>
-        <w:t>}</w:t>
+      <w:r>
+        <w:rPr>
+          <w:rFonts w:ascii="Times New Roman" w:hAnsi="Times New Roman" w:cs="Times New Roman"/>
+          <w:sz w:val="21"/>
+          <w:szCs w:val="21"/>
+        </w:rPr>
+        <w:t>{{ defendants[0].name_full() }}</w:t>
       </w:r>
     </w:p>
     <w:p>
@@ -1185,77 +562,13 @@
           <w:szCs w:val="21"/>
         </w:rPr>
       </w:pPr>
-      <w:proofErr w:type="gramStart"/>
-      <w:r>
-        <w:rPr>
-          <w:rFonts w:ascii="Times New Roman" w:hAnsi="Times New Roman" w:cs="Times New Roman"/>
-          <w:sz w:val="21"/>
-          <w:szCs w:val="21"/>
-        </w:rPr>
-        <w:t>{{ defendants</w:t>
-      </w:r>
-      <w:proofErr w:type="gramEnd"/>
-      <w:r>
-        <w:rPr>
-          <w:rFonts w:ascii="Times New Roman" w:hAnsi="Times New Roman" w:cs="Times New Roman"/>
-          <w:sz w:val="21"/>
-          <w:szCs w:val="21"/>
-        </w:rPr>
-        <w:t>[0</w:t>
-      </w:r>
-      <w:proofErr w:type="gramStart"/>
-      <w:r>
-        <w:rPr>
-          <w:rFonts w:ascii="Times New Roman" w:hAnsi="Times New Roman" w:cs="Times New Roman"/>
-          <w:sz w:val="21"/>
-          <w:szCs w:val="21"/>
-        </w:rPr>
-        <w:t>].</w:t>
-      </w:r>
-      <w:proofErr w:type="spellStart"/>
-      <w:r>
-        <w:rPr>
-          <w:rFonts w:ascii="Times New Roman" w:hAnsi="Times New Roman" w:cs="Times New Roman"/>
-          <w:sz w:val="21"/>
-          <w:szCs w:val="21"/>
-        </w:rPr>
-        <w:t>address</w:t>
-      </w:r>
-      <w:proofErr w:type="gramEnd"/>
-      <w:r>
-        <w:rPr>
-          <w:rFonts w:ascii="Times New Roman" w:hAnsi="Times New Roman" w:cs="Times New Roman"/>
-          <w:sz w:val="21"/>
-          <w:szCs w:val="21"/>
-        </w:rPr>
-        <w:t>.line_</w:t>
-      </w:r>
-      <w:proofErr w:type="gramStart"/>
-      <w:r>
-        <w:rPr>
-          <w:rFonts w:ascii="Times New Roman" w:hAnsi="Times New Roman" w:cs="Times New Roman"/>
-          <w:sz w:val="21"/>
-          <w:szCs w:val="21"/>
-        </w:rPr>
-        <w:t>one</w:t>
-      </w:r>
-      <w:proofErr w:type="spellEnd"/>
-      <w:r>
-        <w:rPr>
-          <w:rFonts w:ascii="Times New Roman" w:hAnsi="Times New Roman" w:cs="Times New Roman"/>
-          <w:sz w:val="21"/>
-          <w:szCs w:val="21"/>
-        </w:rPr>
-        <w:t>() }</w:t>
-      </w:r>
-      <w:proofErr w:type="gramEnd"/>
-      <w:r>
-        <w:rPr>
-          <w:rFonts w:ascii="Times New Roman" w:hAnsi="Times New Roman" w:cs="Times New Roman"/>
-          <w:sz w:val="21"/>
-          <w:szCs w:val="21"/>
-        </w:rPr>
-        <w:t>}</w:t>
+      <w:r>
+        <w:rPr>
+          <w:rFonts w:ascii="Times New Roman" w:hAnsi="Times New Roman" w:cs="Times New Roman"/>
+          <w:sz w:val="21"/>
+          <w:szCs w:val="21"/>
+        </w:rPr>
+        <w:t>{{ defendants[0].address.line_one() }}</w:t>
       </w:r>
     </w:p>
     <w:p>
@@ -1268,77 +581,13 @@
           <w:szCs w:val="21"/>
         </w:rPr>
       </w:pPr>
-      <w:proofErr w:type="gramStart"/>
-      <w:r>
-        <w:rPr>
-          <w:rFonts w:ascii="Times New Roman" w:hAnsi="Times New Roman" w:cs="Times New Roman"/>
-          <w:sz w:val="21"/>
-          <w:szCs w:val="21"/>
-        </w:rPr>
-        <w:t>{{ defendants</w:t>
-      </w:r>
-      <w:proofErr w:type="gramEnd"/>
-      <w:r>
-        <w:rPr>
-          <w:rFonts w:ascii="Times New Roman" w:hAnsi="Times New Roman" w:cs="Times New Roman"/>
-          <w:sz w:val="21"/>
-          <w:szCs w:val="21"/>
-        </w:rPr>
-        <w:t>[0</w:t>
-      </w:r>
-      <w:proofErr w:type="gramStart"/>
-      <w:r>
-        <w:rPr>
-          <w:rFonts w:ascii="Times New Roman" w:hAnsi="Times New Roman" w:cs="Times New Roman"/>
-          <w:sz w:val="21"/>
-          <w:szCs w:val="21"/>
-        </w:rPr>
-        <w:t>].</w:t>
-      </w:r>
-      <w:proofErr w:type="spellStart"/>
-      <w:r>
-        <w:rPr>
-          <w:rFonts w:ascii="Times New Roman" w:hAnsi="Times New Roman" w:cs="Times New Roman"/>
-          <w:sz w:val="21"/>
-          <w:szCs w:val="21"/>
-        </w:rPr>
-        <w:t>address</w:t>
-      </w:r>
-      <w:proofErr w:type="gramEnd"/>
-      <w:r>
-        <w:rPr>
-          <w:rFonts w:ascii="Times New Roman" w:hAnsi="Times New Roman" w:cs="Times New Roman"/>
-          <w:sz w:val="21"/>
-          <w:szCs w:val="21"/>
-        </w:rPr>
-        <w:t>.line_</w:t>
-      </w:r>
-      <w:proofErr w:type="gramStart"/>
-      <w:r>
-        <w:rPr>
-          <w:rFonts w:ascii="Times New Roman" w:hAnsi="Times New Roman" w:cs="Times New Roman"/>
-          <w:sz w:val="21"/>
-          <w:szCs w:val="21"/>
-        </w:rPr>
-        <w:t>two</w:t>
-      </w:r>
-      <w:proofErr w:type="spellEnd"/>
-      <w:r>
-        <w:rPr>
-          <w:rFonts w:ascii="Times New Roman" w:hAnsi="Times New Roman" w:cs="Times New Roman"/>
-          <w:sz w:val="21"/>
-          <w:szCs w:val="21"/>
-        </w:rPr>
-        <w:t>() }</w:t>
-      </w:r>
-      <w:proofErr w:type="gramEnd"/>
-      <w:r>
-        <w:rPr>
-          <w:rFonts w:ascii="Times New Roman" w:hAnsi="Times New Roman" w:cs="Times New Roman"/>
-          <w:sz w:val="21"/>
-          <w:szCs w:val="21"/>
-        </w:rPr>
-        <w:t>}</w:t>
+      <w:r>
+        <w:rPr>
+          <w:rFonts w:ascii="Times New Roman" w:hAnsi="Times New Roman" w:cs="Times New Roman"/>
+          <w:sz w:val="21"/>
+          <w:szCs w:val="21"/>
+        </w:rPr>
+        <w:t>{{ defendants[0].address.line_two() }}</w:t>
       </w:r>
     </w:p>
     <w:p>
@@ -1365,121 +614,37 @@
         </w:rPr>
         <w:t xml:space="preserve">{% if </w:t>
       </w:r>
-      <w:proofErr w:type="gramStart"/>
-      <w:r>
-        <w:rPr>
-          <w:rFonts w:ascii="Times New Roman" w:hAnsi="Times New Roman" w:cs="Times New Roman"/>
-          <w:sz w:val="21"/>
-          <w:szCs w:val="21"/>
-        </w:rPr>
-        <w:t>defendants[</w:t>
-      </w:r>
-      <w:proofErr w:type="gramEnd"/>
-      <w:r>
-        <w:rPr>
-          <w:rFonts w:ascii="Times New Roman" w:hAnsi="Times New Roman" w:cs="Times New Roman"/>
-          <w:sz w:val="21"/>
-          <w:szCs w:val="21"/>
-        </w:rPr>
-        <w:t>0].</w:t>
-      </w:r>
-      <w:proofErr w:type="spellStart"/>
-      <w:r>
-        <w:rPr>
-          <w:rFonts w:ascii="Times New Roman" w:hAnsi="Times New Roman" w:cs="Times New Roman"/>
-          <w:sz w:val="21"/>
-          <w:szCs w:val="21"/>
-        </w:rPr>
-        <w:t>no_phone_number</w:t>
-      </w:r>
-      <w:proofErr w:type="spellEnd"/>
-      <w:r>
-        <w:rPr>
-          <w:rFonts w:ascii="Times New Roman" w:hAnsi="Times New Roman" w:cs="Times New Roman"/>
-          <w:sz w:val="21"/>
-          <w:szCs w:val="21"/>
-        </w:rPr>
-        <w:t xml:space="preserve"> </w:t>
-      </w:r>
-      <w:proofErr w:type="gramStart"/>
-      <w:r>
-        <w:rPr>
-          <w:rFonts w:ascii="Times New Roman" w:hAnsi="Times New Roman" w:cs="Times New Roman"/>
-          <w:sz w:val="21"/>
-          <w:szCs w:val="21"/>
-        </w:rPr>
-        <w:t>%}</w:t>
-      </w:r>
-      <w:r>
-        <w:rPr>
-          <w:rFonts w:ascii="Times New Roman" w:hAnsi="Times New Roman" w:cs="Times New Roman"/>
-          <w:sz w:val="21"/>
-          <w:szCs w:val="21"/>
-        </w:rPr>
-        <w:t>Unknown</w:t>
-      </w:r>
-      <w:proofErr w:type="gramEnd"/>
-      <w:r>
-        <w:rPr>
-          <w:rFonts w:ascii="Times New Roman" w:hAnsi="Times New Roman" w:cs="Times New Roman"/>
-          <w:sz w:val="21"/>
-          <w:szCs w:val="21"/>
-        </w:rPr>
-        <w:t xml:space="preserve"> </w:t>
-      </w:r>
-      <w:proofErr w:type="gramStart"/>
-      <w:r>
-        <w:rPr>
-          <w:rFonts w:ascii="Times New Roman" w:hAnsi="Times New Roman" w:cs="Times New Roman"/>
-          <w:sz w:val="21"/>
-          <w:szCs w:val="21"/>
-        </w:rPr>
-        <w:t>phone{</w:t>
-      </w:r>
-      <w:proofErr w:type="gramEnd"/>
-      <w:r>
-        <w:rPr>
-          <w:rFonts w:ascii="Times New Roman" w:hAnsi="Times New Roman" w:cs="Times New Roman"/>
-          <w:sz w:val="21"/>
-          <w:szCs w:val="21"/>
-        </w:rPr>
-        <w:t xml:space="preserve">% else </w:t>
-      </w:r>
-      <w:proofErr w:type="gramStart"/>
-      <w:r>
-        <w:rPr>
-          <w:rFonts w:ascii="Times New Roman" w:hAnsi="Times New Roman" w:cs="Times New Roman"/>
-          <w:sz w:val="21"/>
-          <w:szCs w:val="21"/>
-        </w:rPr>
-        <w:t xml:space="preserve">%}{{ </w:t>
-      </w:r>
-      <w:proofErr w:type="spellStart"/>
-      <w:r>
-        <w:rPr>
-          <w:rFonts w:ascii="Times New Roman" w:hAnsi="Times New Roman" w:cs="Times New Roman"/>
-          <w:sz w:val="21"/>
-          <w:szCs w:val="21"/>
-        </w:rPr>
-        <w:t>phone</w:t>
-      </w:r>
-      <w:proofErr w:type="gramEnd"/>
-      <w:r>
-        <w:rPr>
-          <w:rFonts w:ascii="Times New Roman" w:hAnsi="Times New Roman" w:cs="Times New Roman"/>
-          <w:sz w:val="21"/>
-          <w:szCs w:val="21"/>
-        </w:rPr>
-        <w:t>_number_formatted</w:t>
-      </w:r>
-      <w:proofErr w:type="spellEnd"/>
-      <w:r>
-        <w:rPr>
-          <w:rFonts w:ascii="Times New Roman" w:hAnsi="Times New Roman" w:cs="Times New Roman"/>
-          <w:sz w:val="21"/>
-          <w:szCs w:val="21"/>
-        </w:rPr>
-        <w:t>(</w:t>
+      <w:r>
+        <w:rPr>
+          <w:rFonts w:ascii="Times New Roman" w:hAnsi="Times New Roman" w:cs="Times New Roman"/>
+          <w:sz w:val="21"/>
+          <w:szCs w:val="21"/>
+        </w:rPr>
+        <w:t>defendants[0].no_phone_number</w:t>
+      </w:r>
+      <w:r>
+        <w:rPr>
+          <w:rFonts w:ascii="Times New Roman" w:hAnsi="Times New Roman" w:cs="Times New Roman"/>
+          <w:sz w:val="21"/>
+          <w:szCs w:val="21"/>
+        </w:rPr>
+        <w:t xml:space="preserve"> %}</w:t>
+      </w:r>
+      <w:r>
+        <w:rPr>
+          <w:rFonts w:ascii="Times New Roman" w:hAnsi="Times New Roman" w:cs="Times New Roman"/>
+          <w:sz w:val="21"/>
+          <w:szCs w:val="21"/>
+        </w:rPr>
+        <w:t xml:space="preserve">Unknown phone{% else %}{{ </w:t>
+      </w:r>
+      <w:r>
+        <w:rPr>
+          <w:rFonts w:ascii="Times New Roman" w:hAnsi="Times New Roman" w:cs="Times New Roman"/>
+          <w:sz w:val="21"/>
+          <w:szCs w:val="21"/>
+        </w:rPr>
+        <w:t>phone_number_formatted(</w:t>
       </w:r>
       <w:r>
         <w:rPr>
@@ -1495,53 +660,15 @@
           <w:sz w:val="21"/>
           <w:szCs w:val="21"/>
         </w:rPr>
-        <w:t>[0</w:t>
-      </w:r>
-      <w:proofErr w:type="gramStart"/>
-      <w:r>
-        <w:rPr>
-          <w:rFonts w:ascii="Times New Roman" w:hAnsi="Times New Roman" w:cs="Times New Roman"/>
-          <w:sz w:val="21"/>
-          <w:szCs w:val="21"/>
-        </w:rPr>
-        <w:t>].</w:t>
-      </w:r>
-      <w:proofErr w:type="spellStart"/>
-      <w:r>
-        <w:rPr>
-          <w:rFonts w:ascii="Times New Roman" w:hAnsi="Times New Roman" w:cs="Times New Roman"/>
-          <w:sz w:val="21"/>
-          <w:szCs w:val="21"/>
-        </w:rPr>
-        <w:t>phone</w:t>
-      </w:r>
-      <w:proofErr w:type="gramEnd"/>
-      <w:r>
-        <w:rPr>
-          <w:rFonts w:ascii="Times New Roman" w:hAnsi="Times New Roman" w:cs="Times New Roman"/>
-          <w:sz w:val="21"/>
-          <w:szCs w:val="21"/>
-        </w:rPr>
-        <w:t>_number</w:t>
-      </w:r>
-      <w:proofErr w:type="spellEnd"/>
-      <w:proofErr w:type="gramStart"/>
-      <w:r>
-        <w:rPr>
-          <w:rFonts w:ascii="Times New Roman" w:hAnsi="Times New Roman" w:cs="Times New Roman"/>
-          <w:sz w:val="21"/>
-          <w:szCs w:val="21"/>
-        </w:rPr>
-        <w:t>) }}{</w:t>
-      </w:r>
-      <w:proofErr w:type="gramEnd"/>
-      <w:r>
-        <w:rPr>
-          <w:rFonts w:ascii="Times New Roman" w:hAnsi="Times New Roman" w:cs="Times New Roman"/>
-          <w:sz w:val="21"/>
-          <w:szCs w:val="21"/>
-        </w:rPr>
-        <w:t>% endif %}</w:t>
+        <w:t>[0].phone_number</w:t>
+      </w:r>
+      <w:r>
+        <w:rPr>
+          <w:rFonts w:ascii="Times New Roman" w:hAnsi="Times New Roman" w:cs="Times New Roman"/>
+          <w:sz w:val="21"/>
+          <w:szCs w:val="21"/>
+        </w:rPr>
+        <w:t>) }}{% endif %}</w:t>
       </w:r>
     </w:p>
     <w:p>
@@ -1799,7 +926,6 @@
                 <w:szCs w:val="22"/>
               </w:rPr>
             </w:pPr>
-            <w:proofErr w:type="gramStart"/>
             <w:r>
               <w:rPr>
                 <w:rFonts w:ascii="Times New Roman" w:hAnsi="Times New Roman" w:cs="Times New Roman"/>
@@ -1816,7 +942,6 @@
               </w:rPr>
               <w:t>d</w:t>
             </w:r>
-            <w:proofErr w:type="gramEnd"/>
             <w:r>
               <w:rPr>
                 <w:rFonts w:ascii="Times New Roman" w:hAnsi="Times New Roman" w:cs="Times New Roman"/>
@@ -1859,7 +984,6 @@
               </w:rPr>
               <w:t xml:space="preserve">        </w:t>
             </w:r>
-            <w:proofErr w:type="gramStart"/>
             <w:r>
               <w:rPr>
                 <w:rFonts w:ascii="Times New Roman" w:hAnsi="Times New Roman" w:cs="Times New Roman"/>
@@ -1874,16 +998,7 @@
                 <w:sz w:val="22"/>
                 <w:szCs w:val="22"/>
               </w:rPr>
-              <w:t>_</w:t>
-            </w:r>
-            <w:proofErr w:type="gramEnd"/>
-            <w:r>
-              <w:rPr>
-                <w:rFonts w:ascii="Times New Roman" w:hAnsi="Times New Roman" w:cs="Times New Roman"/>
-                <w:sz w:val="22"/>
-                <w:szCs w:val="22"/>
-              </w:rPr>
-              <w:t>_________________________________</w:t>
+              <w:t>__________________________________</w:t>
             </w:r>
           </w:p>
           <w:p>
@@ -1895,41 +1010,13 @@
                 <w:szCs w:val="22"/>
               </w:rPr>
             </w:pPr>
-            <w:proofErr w:type="gramStart"/>
             <w:r>
               <w:rPr>
                 <w:rFonts w:ascii="Times New Roman" w:hAnsi="Times New Roman" w:cs="Times New Roman"/>
                 <w:sz w:val="22"/>
                 <w:szCs w:val="22"/>
               </w:rPr>
-              <w:t>{{ plaintiffs</w:t>
-            </w:r>
-            <w:proofErr w:type="gramEnd"/>
-            <w:r>
-              <w:rPr>
-                <w:rFonts w:ascii="Times New Roman" w:hAnsi="Times New Roman" w:cs="Times New Roman"/>
-                <w:sz w:val="22"/>
-                <w:szCs w:val="22"/>
-              </w:rPr>
-              <w:t>[0</w:t>
-            </w:r>
-            <w:proofErr w:type="gramStart"/>
-            <w:r>
-              <w:rPr>
-                <w:rFonts w:ascii="Times New Roman" w:hAnsi="Times New Roman" w:cs="Times New Roman"/>
-                <w:sz w:val="22"/>
-                <w:szCs w:val="22"/>
-              </w:rPr>
-              <w:t>] }</w:t>
-            </w:r>
-            <w:proofErr w:type="gramEnd"/>
-            <w:r>
-              <w:rPr>
-                <w:rFonts w:ascii="Times New Roman" w:hAnsi="Times New Roman" w:cs="Times New Roman"/>
-                <w:sz w:val="22"/>
-                <w:szCs w:val="22"/>
-              </w:rPr>
-              <w:t>}, Plaintiff, Self-represented</w:t>
+              <w:t>{{ plaintiffs[0] }}, Plaintiff, Self-represented</w:t>
             </w:r>
           </w:p>
         </w:tc>

</xml_diff>